<commit_message>
refactor(lab3): replace ё to е
</commit_message>
<xml_diff>
--- a/2_semester/NeuralNetworks/lab3/report/1306_ShavrinAP_lab3.docx
+++ b/2_semester/NeuralNetworks/lab3/report/1306_ShavrinAP_lab3.docx
@@ -284,16 +284,7 @@
           <w:szCs w:val="28"/>
           <w:lang w:eastAsia="ru-RU" w:bidi="ar-SA"/>
         </w:rPr>
-        <w:t>те №</w:t>
-      </w:r>
-      <w:r>
-        <w:rPr>
-          <w:b/>
-          <w:color w:val="auto"/>
-          <w:szCs w:val="28"/>
-          <w:lang w:eastAsia="ru-RU" w:bidi="ar-SA"/>
-        </w:rPr>
-        <w:t>3</w:t>
+        <w:t>те №3</w:t>
       </w:r>
     </w:p>
     <w:p>
@@ -457,9 +448,9 @@
         </w:tblCellMar>
       </w:tblPr>
       <w:tblGrid>
-        <w:gridCol w:w="4346"/>
+        <w:gridCol w:w="4345"/>
         <w:gridCol w:w="2609"/>
-        <w:gridCol w:w="2899"/>
+        <w:gridCol w:w="2900"/>
       </w:tblGrid>
       <w:tr>
         <w:trPr>
@@ -467,7 +458,7 @@
         </w:trPr>
         <w:tc>
           <w:tcPr>
-            <w:tcW w:w="4346" w:type="dxa"/>
+            <w:tcW w:w="4345" w:type="dxa"/>
             <w:tcBorders/>
             <w:vAlign w:val="bottom"/>
           </w:tcPr>
@@ -512,7 +503,7 @@
         </w:tc>
         <w:tc>
           <w:tcPr>
-            <w:tcW w:w="2899" w:type="dxa"/>
+            <w:tcW w:w="2900" w:type="dxa"/>
             <w:tcBorders/>
             <w:vAlign w:val="bottom"/>
           </w:tcPr>
@@ -541,7 +532,7 @@
         </w:trPr>
         <w:tc>
           <w:tcPr>
-            <w:tcW w:w="4346" w:type="dxa"/>
+            <w:tcW w:w="4345" w:type="dxa"/>
             <w:tcBorders/>
             <w:vAlign w:val="bottom"/>
           </w:tcPr>
@@ -587,7 +578,7 @@
         </w:tc>
         <w:tc>
           <w:tcPr>
-            <w:tcW w:w="2899" w:type="dxa"/>
+            <w:tcW w:w="2900" w:type="dxa"/>
             <w:tcBorders/>
             <w:vAlign w:val="bottom"/>
           </w:tcPr>
@@ -951,29 +942,31 @@
           <w:szCs w:val="28"/>
           <w:lang w:eastAsia="ru-RU" w:bidi="ar-SA"/>
         </w:rPr>
-        <w:t xml:space="preserve">Для нормализации данных используется стандартизация (вычитание среднего и деление на стандартное отклонение), рассчитанное по обучающей выборке и примененное к обеим выборкам </w:t>
-      </w:r>
-      <w:r>
+        <w:t>Для нормализации данных используется стандартизация (вычитание среднего и деление на стандартное отклонение), рассчитанное по обучающей выборке и примененное к обеим выборкам (рисунок 1).</w:t>
+      </w:r>
+    </w:p>
+    <w:p>
+      <w:pPr>
+        <w:pStyle w:val="Standard"/>
+        <w:ind w:hanging="0" w:left="0" w:right="0"/>
         <w:rPr>
           <w:color w:val="auto"/>
           <w:szCs w:val="28"/>
           <w:lang w:eastAsia="ru-RU" w:bidi="ar-SA"/>
         </w:rPr>
-        <w:t>(рисунок 1)</w:t>
-      </w:r>
+      </w:pPr>
       <w:r>
         <w:rPr>
           <w:color w:val="auto"/>
           <w:szCs w:val="28"/>
           <w:lang w:eastAsia="ru-RU" w:bidi="ar-SA"/>
         </w:rPr>
-        <w:t>.</w:t>
-      </w:r>
-    </w:p>
-    <w:p>
-      <w:pPr>
-        <w:pStyle w:val="Standard"/>
-        <w:ind w:hanging="0" w:left="0" w:right="0"/>
+      </w:r>
+    </w:p>
+    <w:p>
+      <w:pPr>
+        <w:pStyle w:val="Standard"/>
+        <w:jc w:val="center"/>
         <w:rPr>
           <w:color w:val="auto"/>
           <w:szCs w:val="28"/>
@@ -981,22 +974,8 @@
         </w:rPr>
       </w:pPr>
       <w:r>
-        <w:rPr/>
-      </w:r>
-    </w:p>
-    <w:p>
-      <w:pPr>
-        <w:pStyle w:val="Standard"/>
-        <w:jc w:val="center"/>
-        <w:rPr>
-          <w:color w:val="auto"/>
-          <w:szCs w:val="28"/>
-          <w:lang w:eastAsia="ru-RU" w:bidi="ar-SA"/>
-        </w:rPr>
-      </w:pPr>
-      <w:r>
         <w:drawing>
-          <wp:anchor distT="0" distB="0" distL="0" distR="0" simplePos="0" relativeHeight="2" behindDoc="0" locked="0" layoutInCell="0" allowOverlap="1">
+          <wp:anchor distT="0" distB="0" distL="0" distR="0" simplePos="0" relativeHeight="8" behindDoc="0" locked="0" layoutInCell="0" allowOverlap="1">
             <wp:simplePos x="0" y="0"/>
             <wp:positionH relativeFrom="column">
               <wp:align>center</wp:align>
@@ -1066,23 +1045,7 @@
           <w:szCs w:val="28"/>
           <w:lang w:eastAsia="ru-RU" w:bidi="ar-SA"/>
         </w:rPr>
-        <w:t xml:space="preserve">Для проведения экспериментов была написана функция </w:t>
-      </w:r>
-      <w:r>
-        <w:rPr>
-          <w:color w:val="auto"/>
-          <w:szCs w:val="28"/>
-          <w:lang w:eastAsia="ru-RU" w:bidi="ar-SA"/>
-        </w:rPr>
-        <w:t>build</w:t>
-      </w:r>
-      <w:r>
-        <w:rPr>
-          <w:color w:val="auto"/>
-          <w:szCs w:val="28"/>
-          <w:lang w:eastAsia="ru-RU" w:bidi="ar-SA"/>
-        </w:rPr>
-        <w:t>_model() (рисунок 2). Модель представляет собой полносвязную нейронную сеть с двумя скрытыми слоями по 64 нейрона с функцией активации ReLU. Выбор архитектуры обусловлен необходимостью моделировать нелинейные зависимости в данных Boston Housing, содержащем 13 признаков.</w:t>
+        <w:t>Для проведения экспериментов была написана функция build_model() (рисунок 2). Модель представляет собой полносвязную нейронную сеть с двумя скрытыми слоями по 64 нейрона с функцией активации ReLU. Выбор архитектуры обусловлен необходимостью моделировать нелинейные зависимости в данных Boston Housing, содержащем 13 признаков.</w:t>
       </w:r>
     </w:p>
     <w:p>
@@ -1132,6 +1095,7 @@
           <w:ilvl w:val="0"/>
           <w:numId w:val="4"/>
         </w:numPr>
+        <w:ind w:hanging="360" w:left="720" w:right="0"/>
         <w:rPr>
           <w:color w:val="auto"/>
           <w:szCs w:val="28"/>
@@ -1154,6 +1118,7 @@
           <w:ilvl w:val="0"/>
           <w:numId w:val="4"/>
         </w:numPr>
+        <w:ind w:hanging="360" w:left="720" w:right="0"/>
         <w:rPr>
           <w:color w:val="auto"/>
           <w:szCs w:val="28"/>
@@ -1176,7 +1141,7 @@
           <w:ilvl w:val="0"/>
           <w:numId w:val="0"/>
         </w:numPr>
-        <w:ind w:hanging="0" w:left="0"/>
+        <w:ind w:hanging="0" w:left="0" w:right="0"/>
         <w:rPr>
           <w:color w:val="auto"/>
           <w:szCs w:val="28"/>
@@ -1204,7 +1169,7 @@
     <w:p>
       <w:pPr>
         <w:pStyle w:val="Standard"/>
-        <w:ind w:hanging="0" w:left="0"/>
+        <w:ind w:hanging="0" w:left="0" w:right="0"/>
         <w:rPr>
           <w:color w:val="auto"/>
           <w:szCs w:val="28"/>
@@ -1224,7 +1189,7 @@
     <w:p>
       <w:pPr>
         <w:pStyle w:val="Standard"/>
-        <w:ind w:hanging="0" w:left="0"/>
+        <w:ind w:hanging="0" w:left="0" w:right="0"/>
         <w:jc w:val="center"/>
         <w:rPr>
           <w:szCs w:val="28"/>
@@ -1233,7 +1198,7 @@
       </w:pPr>
       <w:r>
         <w:drawing>
-          <wp:anchor distT="0" distB="0" distL="0" distR="0" simplePos="0" relativeHeight="3" behindDoc="0" locked="0" layoutInCell="0" allowOverlap="1">
+          <wp:anchor distT="0" distB="0" distL="0" distR="0" simplePos="0" relativeHeight="9" behindDoc="0" locked="0" layoutInCell="0" allowOverlap="1">
             <wp:simplePos x="0" y="0"/>
             <wp:positionH relativeFrom="column">
               <wp:align>center</wp:align>
@@ -1291,7 +1256,7 @@
     <w:p>
       <w:pPr>
         <w:pStyle w:val="Standard"/>
-        <w:ind w:hanging="0" w:left="0"/>
+        <w:ind w:hanging="0" w:left="0" w:right="0"/>
         <w:jc w:val="left"/>
         <w:rPr>
           <w:szCs w:val="28"/>
@@ -1304,21 +1269,13 @@
           <w:szCs w:val="28"/>
           <w:lang w:eastAsia="ru-RU" w:bidi="ar-SA"/>
         </w:rPr>
-        <w:t xml:space="preserve">Функция kfold_cross_validation реализует K-fold разбиение обучающей выборки, обучение модели на каждом фолде и сохранение истории обучения. Это позволяет в дальнейшем анализировать динамику метрик </w:t>
-      </w:r>
-      <w:r>
-        <w:rPr>
-          <w:color w:val="auto"/>
-          <w:szCs w:val="28"/>
-          <w:lang w:eastAsia="ru-RU" w:bidi="ar-SA"/>
-        </w:rPr>
-        <w:t>(рисунок 3).</w:t>
-      </w:r>
-    </w:p>
-    <w:p>
-      <w:pPr>
-        <w:pStyle w:val="Standard"/>
-        <w:ind w:hanging="0" w:left="0"/>
+        <w:t>Функция kfold_cross_validation реализует K-fold разбиение обучающей выборки, обучение модели на каждом фолде и сохранение истории обучения. Это позволяет в дальнейшем анализировать динамику метрик (рисунок 3).</w:t>
+      </w:r>
+    </w:p>
+    <w:p>
+      <w:pPr>
+        <w:pStyle w:val="Standard"/>
+        <w:ind w:hanging="0" w:left="0" w:right="0"/>
         <w:jc w:val="center"/>
         <w:rPr>
           <w:szCs w:val="28"/>
@@ -1327,7 +1284,7 @@
       </w:pPr>
       <w:r>
         <w:drawing>
-          <wp:anchor distT="0" distB="0" distL="0" distR="0" simplePos="0" relativeHeight="4" behindDoc="0" locked="0" layoutInCell="0" allowOverlap="1">
+          <wp:anchor distT="0" distB="0" distL="0" distR="0" simplePos="0" relativeHeight="10" behindDoc="0" locked="0" layoutInCell="0" allowOverlap="1">
             <wp:simplePos x="0" y="0"/>
             <wp:positionH relativeFrom="column">
               <wp:align>center</wp:align>
@@ -1379,23 +1336,7 @@
           <w:szCs w:val="28"/>
           <w:lang w:eastAsia="ru-RU" w:bidi="ar-SA"/>
         </w:rPr>
-        <w:t xml:space="preserve">Рисунок </w:t>
-      </w:r>
-      <w:r>
-        <w:rPr>
-          <w:color w:val="auto"/>
-          <w:szCs w:val="28"/>
-          <w:lang w:eastAsia="ru-RU" w:bidi="ar-SA"/>
-        </w:rPr>
-        <w:t>3</w:t>
-      </w:r>
-      <w:r>
-        <w:rPr>
-          <w:color w:val="auto"/>
-          <w:szCs w:val="28"/>
-          <w:lang w:eastAsia="ru-RU" w:bidi="ar-SA"/>
-        </w:rPr>
-        <w:t>. Функция K-fold обучения.</w:t>
+        <w:t>Рисунок 3. Функция K-fold обучения.</w:t>
       </w:r>
     </w:p>
     <w:p>
@@ -1432,53 +1373,23 @@
           <w:szCs w:val="28"/>
           <w:lang w:eastAsia="ru-RU" w:bidi="ar-SA"/>
         </w:rPr>
-        <w:t xml:space="preserve">Для K=4 была проведена кросс-валидация на 100 эпохах. На рис. </w:t>
-      </w:r>
-      <w:r>
-        <w:rPr>
-          <w:szCs w:val="28"/>
-          <w:lang w:eastAsia="ru-RU" w:bidi="ar-SA"/>
-        </w:rPr>
-        <w:t>4</w:t>
-      </w:r>
-      <w:r>
-        <w:rPr>
-          <w:szCs w:val="28"/>
-          <w:lang w:eastAsia="ru-RU" w:bidi="ar-SA"/>
-        </w:rPr>
-        <w:t xml:space="preserve"> представлен график средней абсолютной ошибки на валидации (val_mae) по эпохам для каждого фолда и усреднённая кривая. </w:t>
+        <w:t xml:space="preserve">Для K=4 была проведена кросс-валидация на 100 эпохах. На рис. 4 представлен график средней абсолютной ошибки на валидации (val_mae) по эпохам для каждого фолда и усредненная кривая. </w:t>
       </w:r>
       <w:r>
         <w:rPr/>
-        <w:t xml:space="preserve">На рис. </w:t>
-      </w:r>
-      <w:r>
-        <w:rPr/>
-        <w:t>5</w:t>
-      </w:r>
-      <w:r>
-        <w:rPr/>
-        <w:t xml:space="preserve"> показаны потери на валидации (val_loss) с пропуском первых 10 эпох для лучшей визуализации. Для более точного определения оптимального числа эпох была построена сглаженная кривая усреднённой MAE (окно сглаживания 15, пропущены первые 10 эпох). Минимум достигается на 71-й эпохе (рис. </w:t>
-      </w:r>
-      <w:r>
-        <w:rPr/>
-        <w:t>6</w:t>
-      </w:r>
-      <w:r>
-        <w:rPr/>
-        <w:t>).</w:t>
-      </w:r>
-    </w:p>
-    <w:p>
-      <w:pPr>
-        <w:pStyle w:val="Standard"/>
-        <w:ind w:hanging="0" w:left="0"/>
+        <w:t>На рис. 5 показаны потери на валидации (val_loss) с пропуском первых 10 эпох для лучшей визуализации. Для более точного определения оптимального числа эпох была построена сглаженная кривая усредненной MAE (окно сглаживания 15, пропущены первые 10 эпох). Минимум достигается на 71-й эпохе (рис. 6).</w:t>
+      </w:r>
+    </w:p>
+    <w:p>
+      <w:pPr>
+        <w:pStyle w:val="Standard"/>
+        <w:ind w:hanging="0" w:left="0" w:right="0"/>
         <w:rPr/>
       </w:pPr>
       <w:r>
         <w:rPr/>
         <w:drawing>
-          <wp:anchor distT="0" distB="0" distL="0" distR="0" simplePos="0" relativeHeight="5" behindDoc="0" locked="0" layoutInCell="0" allowOverlap="1">
+          <wp:anchor distT="0" distB="0" distL="0" distR="0" simplePos="0" relativeHeight="11" behindDoc="0" locked="0" layoutInCell="0" allowOverlap="1">
             <wp:simplePos x="0" y="0"/>
             <wp:positionH relativeFrom="column">
               <wp:align>center</wp:align>
@@ -1536,7 +1447,10 @@
         </w:rPr>
       </w:pPr>
       <w:r>
-        <w:rPr/>
+        <w:rPr>
+          <w:szCs w:val="28"/>
+          <w:lang w:eastAsia="ru-RU" w:bidi="ar-SA"/>
+        </w:rPr>
       </w:r>
     </w:p>
     <w:p>
@@ -1553,21 +1467,7 @@
           <w:szCs w:val="28"/>
           <w:lang w:eastAsia="ru-RU" w:bidi="ar-SA"/>
         </w:rPr>
-        <w:t xml:space="preserve">Рисунок </w:t>
-      </w:r>
-      <w:r>
-        <w:rPr>
-          <w:szCs w:val="28"/>
-          <w:lang w:eastAsia="ru-RU" w:bidi="ar-SA"/>
-        </w:rPr>
-        <w:t>4</w:t>
-      </w:r>
-      <w:r>
-        <w:rPr>
-          <w:szCs w:val="28"/>
-          <w:lang w:eastAsia="ru-RU" w:bidi="ar-SA"/>
-        </w:rPr>
-        <w:t>.  График средней абсолютной ошибки</w:t>
+        <w:t>Рисунок 4.  График средней абсолютной ошибки</w:t>
       </w:r>
     </w:p>
     <w:p>
@@ -1581,9 +1481,12 @@
         </w:rPr>
       </w:pPr>
       <w:r>
-        <w:rPr/>
+        <w:rPr>
+          <w:szCs w:val="28"/>
+          <w:lang w:eastAsia="ru-RU" w:bidi="ar-SA"/>
+        </w:rPr>
         <w:drawing>
-          <wp:anchor distT="0" distB="0" distL="0" distR="0" simplePos="0" relativeHeight="6" behindDoc="0" locked="0" layoutInCell="0" allowOverlap="1">
+          <wp:anchor distT="0" distB="0" distL="0" distR="0" simplePos="0" relativeHeight="12" behindDoc="0" locked="0" layoutInCell="0" allowOverlap="1">
             <wp:simplePos x="0" y="0"/>
             <wp:positionH relativeFrom="column">
               <wp:align>center</wp:align>
@@ -1644,21 +1547,7 @@
           <w:szCs w:val="28"/>
           <w:lang w:eastAsia="ru-RU" w:bidi="ar-SA"/>
         </w:rPr>
-        <w:t xml:space="preserve">Рисунок </w:t>
-      </w:r>
-      <w:r>
-        <w:rPr>
-          <w:szCs w:val="28"/>
-          <w:lang w:eastAsia="ru-RU" w:bidi="ar-SA"/>
-        </w:rPr>
-        <w:t>5</w:t>
-      </w:r>
-      <w:r>
-        <w:rPr>
-          <w:szCs w:val="28"/>
-          <w:lang w:eastAsia="ru-RU" w:bidi="ar-SA"/>
-        </w:rPr>
-        <w:t>.  График  потери</w:t>
+        <w:t>Рисунок 5.  График  потери</w:t>
       </w:r>
     </w:p>
     <w:p>
@@ -1677,7 +1566,7 @@
           <w:lang w:eastAsia="ru-RU" w:bidi="ar-SA"/>
         </w:rPr>
         <w:drawing>
-          <wp:anchor distT="0" distB="0" distL="0" distR="0" simplePos="0" relativeHeight="7" behindDoc="0" locked="0" layoutInCell="0" allowOverlap="1">
+          <wp:anchor distT="0" distB="0" distL="0" distR="0" simplePos="0" relativeHeight="13" behindDoc="0" locked="0" layoutInCell="0" allowOverlap="1">
             <wp:simplePos x="0" y="0"/>
             <wp:positionH relativeFrom="column">
               <wp:align>center</wp:align>
@@ -1735,15 +1624,7 @@
       </w:pPr>
       <w:r>
         <w:rPr/>
-        <w:t xml:space="preserve">Рисунок </w:t>
-      </w:r>
-      <w:r>
-        <w:rPr/>
-        <w:t>6</w:t>
-      </w:r>
-      <w:r>
-        <w:rPr/>
-        <w:t>.   График сглаженной кривой усредненной MAE.</w:t>
+        <w:t>Рисунок 6.   График сглаженной кривой усредненной MAE.</w:t>
       </w:r>
     </w:p>
     <w:p>
@@ -1786,14 +1667,7 @@
           <w:b/>
           <w:bCs/>
         </w:rPr>
-        <w:t xml:space="preserve">2. </w:t>
-      </w:r>
-      <w:r>
-        <w:rPr>
-          <w:b/>
-          <w:bCs/>
-        </w:rPr>
-        <w:t>Исследование влияния параметра K</w:t>
+        <w:t>2. Исследование влияния параметра K</w:t>
       </w:r>
     </w:p>
     <w:p>
@@ -1812,41 +1686,11 @@
           <w:lang w:eastAsia="ru-RU" w:bidi="ar-SA"/>
         </w:rPr>
         <w:tab/>
-        <w:t xml:space="preserve">Для фиксированного числа эпох (71) была проведена K-fold кросс-валидация с различными значениями K: 2, 3, 4, 5, 6. Для каждого K вычислялась средняя MAE на последней эпохе по всем фолдам. Результаты приведены на рисунке </w:t>
-      </w:r>
-      <w:r>
-        <w:rPr>
-          <w:szCs w:val="28"/>
-          <w:lang w:eastAsia="ru-RU" w:bidi="ar-SA"/>
-        </w:rPr>
-        <w:t>7</w:t>
-      </w:r>
-      <w:r>
-        <w:rPr>
-          <w:szCs w:val="28"/>
-          <w:lang w:eastAsia="ru-RU" w:bidi="ar-SA"/>
-        </w:rPr>
-        <w:t xml:space="preserve">. </w:t>
+        <w:t xml:space="preserve">Для фиксированного числа эпох (71) была проведена K-fold кросс-валидация с различными значениями K: 2, 3, 4, 5, 6. Для каждого K вычислялась средняя MAE на последней эпохе по всем фолдам. Результаты приведены на рисунке 7. </w:t>
       </w:r>
       <w:r>
         <w:rPr/>
-        <w:t xml:space="preserve">На рис. </w:t>
-      </w:r>
-      <w:r>
-        <w:rPr/>
-        <w:t>8</w:t>
-      </w:r>
-      <w:r>
-        <w:rPr/>
-        <w:t xml:space="preserve"> - </w:t>
-      </w:r>
-      <w:r>
-        <w:rPr/>
-        <w:t>11</w:t>
-      </w:r>
-      <w:r>
-        <w:rPr/>
-        <w:t xml:space="preserve"> представлены графики MAE и потерь на валидации для каждого K при 71 эпохе.</w:t>
+        <w:t>На рис. 8 - 11 представлены графики MAE и потерь на валидации для каждого K при 71 эпохе.</w:t>
       </w:r>
     </w:p>
     <w:p>
@@ -1860,10 +1704,7 @@
         </w:rPr>
       </w:pPr>
       <w:r>
-        <w:rPr>
-          <w:szCs w:val="28"/>
-          <w:lang w:eastAsia="ru-RU" w:bidi="ar-SA"/>
-        </w:rPr>
+        <w:rPr/>
         <w:drawing>
           <wp:inline distT="0" distB="0" distL="0" distR="0">
             <wp:extent cx="4500245" cy="3060700"/>
@@ -1915,23 +1756,7 @@
       </w:pPr>
       <w:r>
         <w:rPr/>
-        <w:t xml:space="preserve">Рисунок </w:t>
-      </w:r>
-      <w:r>
-        <w:rPr/>
-        <w:t>7</w:t>
-      </w:r>
-      <w:r>
-        <w:rPr/>
-        <w:t xml:space="preserve">.  График зависимости усредненной MAE от числа блоков </w:t>
-      </w:r>
-      <w:r>
-        <w:rPr/>
-        <w:t>K</w:t>
-      </w:r>
-      <w:r>
-        <w:rPr/>
-        <w:t>.</w:t>
+        <w:t>Рисунок 7.  График зависимости усредненной MAE от числа блоков K.</w:t>
       </w:r>
     </w:p>
     <w:p>
@@ -1996,23 +1821,7 @@
       </w:pPr>
       <w:r>
         <w:rPr/>
-        <w:t xml:space="preserve">Рисунок </w:t>
-      </w:r>
-      <w:r>
-        <w:rPr/>
-        <w:t>7</w:t>
-      </w:r>
-      <w:r>
-        <w:rPr/>
-        <w:t xml:space="preserve">.  График зависимости усредненной MAE и потерь для </w:t>
-      </w:r>
-      <w:r>
-        <w:rPr/>
-        <w:t xml:space="preserve">2х </w:t>
-      </w:r>
-      <w:r>
-        <w:rPr/>
-        <w:t>блоков.</w:t>
+        <w:t>Рисунок 7.  График зависимости усредненной MAE и потерь для 2х блоков.</w:t>
       </w:r>
     </w:p>
     <w:p>
@@ -2025,7 +1834,10 @@
         </w:rPr>
       </w:pPr>
       <w:r>
-        <w:rPr/>
+        <w:rPr>
+          <w:szCs w:val="28"/>
+          <w:lang w:eastAsia="ru-RU" w:bidi="ar-SA"/>
+        </w:rPr>
       </w:r>
     </w:p>
     <w:p>
@@ -2090,23 +1902,7 @@
       </w:pPr>
       <w:r>
         <w:rPr/>
-        <w:t xml:space="preserve">Рисунок </w:t>
-      </w:r>
-      <w:r>
-        <w:rPr/>
-        <w:t>8</w:t>
-      </w:r>
-      <w:r>
-        <w:rPr/>
-        <w:t xml:space="preserve">.  График зависимости усредненной MAE и потерь для </w:t>
-      </w:r>
-      <w:r>
-        <w:rPr/>
-        <w:t xml:space="preserve">3х </w:t>
-      </w:r>
-      <w:r>
-        <w:rPr/>
-        <w:t>блоков.</w:t>
+        <w:t>Рисунок 8.  График зависимости усредненной MAE и потерь для 3х блоков.</w:t>
       </w:r>
     </w:p>
     <w:p>
@@ -2171,23 +1967,7 @@
       </w:pPr>
       <w:r>
         <w:rPr/>
-        <w:t xml:space="preserve">Рисунок </w:t>
-      </w:r>
-      <w:r>
-        <w:rPr/>
-        <w:t>9</w:t>
-      </w:r>
-      <w:r>
-        <w:rPr/>
-        <w:t xml:space="preserve">.  График зависимости усредненной MAE и потерь для </w:t>
-      </w:r>
-      <w:r>
-        <w:rPr/>
-        <w:t xml:space="preserve">4х </w:t>
-      </w:r>
-      <w:r>
-        <w:rPr/>
-        <w:t>блоков.</w:t>
+        <w:t>Рисунок 9.  График зависимости усредненной MAE и потерь для 4х блоков.</w:t>
       </w:r>
     </w:p>
     <w:p>
@@ -2252,23 +2032,7 @@
       </w:pPr>
       <w:r>
         <w:rPr/>
-        <w:t xml:space="preserve">Рисунок </w:t>
-      </w:r>
-      <w:r>
-        <w:rPr/>
-        <w:t>10</w:t>
-      </w:r>
-      <w:r>
-        <w:rPr/>
-        <w:t xml:space="preserve">.  График зависимости усредненной MAE и потерь для </w:t>
-      </w:r>
-      <w:r>
-        <w:rPr/>
-        <w:t xml:space="preserve">5и </w:t>
-      </w:r>
-      <w:r>
-        <w:rPr/>
-        <w:t>блоков.</w:t>
+        <w:t>Рисунок 10.  График зависимости усредненной MAE и потерь для 5и блоков.</w:t>
       </w:r>
     </w:p>
     <w:p>
@@ -2333,23 +2097,7 @@
       </w:pPr>
       <w:r>
         <w:rPr/>
-        <w:t xml:space="preserve">Рисунок </w:t>
-      </w:r>
-      <w:r>
-        <w:rPr/>
-        <w:t>11</w:t>
-      </w:r>
-      <w:r>
-        <w:rPr/>
-        <w:t xml:space="preserve">.  График зависимости усредненной MAE и потерь для </w:t>
-      </w:r>
-      <w:r>
-        <w:rPr/>
-        <w:t xml:space="preserve">6и </w:t>
-      </w:r>
-      <w:r>
-        <w:rPr/>
-        <w:t>блоков.</w:t>
+        <w:t>Рисунок 11.  График зависимости усредненной MAE и потерь для 6и блоков.</w:t>
       </w:r>
     </w:p>
     <w:p>
@@ -2370,7 +2118,7 @@
           <w:szCs w:val="28"/>
           <w:lang w:eastAsia="ru-RU" w:bidi="ar-SA"/>
         </w:rPr>
-        <w:t xml:space="preserve">Анализ таблицы показывает, что наименьшая средняя ошибка достигается при K=5 (MAE </w:t>
+        <w:t xml:space="preserve">Анализ </w:t>
       </w:r>
       <w:r>
         <w:rPr>
@@ -2379,7 +2127,7 @@
           <w:szCs w:val="28"/>
           <w:lang w:eastAsia="ru-RU" w:bidi="ar-SA"/>
         </w:rPr>
-        <w:t>=</w:t>
+        <w:t>графиков</w:t>
       </w:r>
       <w:r>
         <w:rPr>
@@ -2388,7 +2136,7 @@
           <w:szCs w:val="28"/>
           <w:lang w:eastAsia="ru-RU" w:bidi="ar-SA"/>
         </w:rPr>
-        <w:t xml:space="preserve"> 2.33). При увеличении K до 6 ошибка незначительно возрастает. Это может объясняться тем, что при слишком большом числе фолдов (K=6) объем обучающей выборки на каждом шаге становится меньше, что приводит к некоторому увеличению дисперсии оценки. При малых K (2–3) оценка менее стабильна, и ошибка выше.</w:t>
+        <w:t xml:space="preserve"> показывает, что наименьшая средняя ошибка достигается при K=5 (MAE = 2.33). При увеличении K до 6 ошибка незначительно возрастает. Это может объясняться тем, что при слишком большом числе фолдов (K=6) объем обучающей выборки на каждом шаге становится меньше, что приводит к некоторому увеличению дисперсии оценки. При малых K (2–3) оценка менее стабильна, и ошибка выше.</w:t>
       </w:r>
     </w:p>
     <w:p>
@@ -2409,7 +2157,7 @@
           <w:szCs w:val="28"/>
           <w:lang w:eastAsia="ru-RU" w:bidi="ar-SA"/>
         </w:rPr>
-        <w:t>При K=5 разброс значений MAE между фолдами был наименьшим, что указывает на более устойчивую оценку качества модели. При K=2 разброс максимален, что делает оценку ненадёжной.</w:t>
+        <w:t>При K=5 разброс значений MAE между фолдами был наименьшим, что указывает на более устойчивую оценку качества модели. При K=2 разброс максимален, что делает оценку ненадежной.</w:t>
       </w:r>
     </w:p>
     <w:p>
@@ -2474,6 +2222,7 @@
           <w:ilvl w:val="0"/>
           <w:numId w:val="3"/>
         </w:numPr>
+        <w:ind w:hanging="360" w:left="1080" w:right="0"/>
         <w:rPr/>
       </w:pPr>
       <w:r>
@@ -2488,11 +2237,12 @@
           <w:ilvl w:val="0"/>
           <w:numId w:val="3"/>
         </w:numPr>
+        <w:ind w:hanging="360" w:left="1080" w:right="0"/>
         <w:rPr/>
       </w:pPr>
       <w:r>
         <w:rPr/>
-        <w:t>С помощью K-fold кросс-валидации (K=4) были построены кривые обучения. Анализ графиков MAE и loss на валидации показал, что после определённого этапа (примерно 30–40 эпох) ошибка перестаёт существенно снижаться и начинает флуктуировать, что свидетельствует о начале переобучения. Применение сглаживания (окно 15) позволило более точно локализовать минимум усреднённой MAE. Оптимальное число эпох составило 71. Это значение обеспечивает наилучшее соотношение качества обучения и обобщающей способности.</w:t>
+        <w:t>С помощью K-fold кросс-валидации (K=4) были построены кривые обучения. Анализ графиков MAE и loss на валидации показал, что после определенного этапа (примерно 30–40 эпох) ошибка перестает существенно снижаться и начинает флуктуировать, что свидетельствует о начале переобучения. Применение сглаживания (окно 15) позволило более точно локализовать минимум усредненной MAE. Оптимальное число эпох составило 71. Это значение обеспечивает наилучшее соотношение качества обучения и обобщающей способности.</w:t>
       </w:r>
     </w:p>
     <w:p>
@@ -2502,11 +2252,12 @@
           <w:ilvl w:val="0"/>
           <w:numId w:val="3"/>
         </w:numPr>
+        <w:ind w:hanging="360" w:left="1080" w:right="0"/>
         <w:rPr/>
       </w:pPr>
       <w:r>
         <w:rPr/>
-        <w:t>Проведена серия экспериментов с различными значениями K (от 2 до 6) при фиксированном числе эпох (71). K=2 дал наибольшую ошибку (2.56), что объясняется малым объемом валидационной выборки и, как следствие, высокой дисперсией оценки. K=3 и K=4 показали промежуточные результаты (2.42 и 2.47 соответственно). K=5 оказался оптимальным (2.33), обеспечивая наилучший компромисс между смещением и дисперсией. K=6 привёл к незначительному росту ошибки (2.42), что может быть связано с уменьшением обучающей выборки на каждом шаге и увеличением разброса оценок между фолдами.</w:t>
+        <w:t>Проведена серия экспериментов с различными значениями K (от 2 до 6) при фиксированном числе эпох (71). K=2 дал наибольшую ошибку (2.56), что объясняется малым объемом валидационной выборки и, как следствие, высокой дисперсией оценки. K=3 и K=4 показали промежуточные результаты (2.42 и 2.47 соответственно). K=5 оказался оптимальным (2.33), обеспечивая наилучший компромисс между смещением и дисперсией. K=6 привел к незначительному росту ошибки (2.42), что может быть связано с уменьшением обучающей выборки на каждом шаге и увеличением разброса оценок между фолдами.</w:t>
       </w:r>
     </w:p>
     <w:p>
@@ -2516,7 +2267,7 @@
           <w:ilvl w:val="0"/>
           <w:numId w:val="0"/>
         </w:numPr>
-        <w:ind w:hanging="0" w:left="0"/>
+        <w:ind w:hanging="0" w:left="0" w:right="0"/>
         <w:rPr/>
       </w:pPr>
       <w:r>
@@ -2563,19 +2314,7 @@
         <w:rPr>
           <w:lang w:val="en-US"/>
         </w:rPr>
-        <w:t>lab</w:t>
-      </w:r>
-      <w:r>
-        <w:rPr>
-          <w:lang w:val="en-US"/>
-        </w:rPr>
-        <w:t>3</w:t>
-      </w:r>
-      <w:r>
-        <w:rPr>
-          <w:lang w:val="en-US"/>
-        </w:rPr>
-        <w:t>.ipynb</w:t>
+        <w:t>lab3.ipynb</w:t>
       </w:r>
     </w:p>
     <w:p>
@@ -4410,7 +4149,7 @@
           <w:sz w:val="24"/>
           <w:szCs w:val="24"/>
         </w:rPr>
-        <w:t>Строит графики указанной метрики для каждого фолда и усреднённую кривую,</w:t>
+        <w:t>Строит графики указанной метрики для каждого фолда и усредненную кривую,</w:t>
       </w:r>
     </w:p>
     <w:p>
@@ -5605,7 +5344,7 @@
           <w:sz w:val="24"/>
           <w:szCs w:val="24"/>
         </w:rPr>
-        <w:t>title=f'Сглаженная усреднённая MAE (пропущены первые 10 эпох)',</w:t>
+        <w:t>title=f'Сглаженная усредненная MAE (пропущены первые 10 эпох)',</w:t>
       </w:r>
     </w:p>
     <w:p>
@@ -7552,8 +7291,8 @@
     <w:qFormat/>
     <w:rPr/>
   </w:style>
-  <w:style w:type="character" w:styleId="Bulletsuser">
-    <w:name w:val="Bullets (user)"/>
+  <w:style w:type="character" w:styleId="Bullets">
+    <w:name w:val="Bullets"/>
     <w:qFormat/>
     <w:rPr>
       <w:rFonts w:ascii="OpenSymbol;Arial Unicode MS" w:hAnsi="OpenSymbol;Arial Unicode MS" w:eastAsia="OpenSymbol;Arial Unicode MS" w:cs="OpenSymbol;Arial Unicode MS"/>
@@ -7581,8 +7320,8 @@
       <w:u w:val="single"/>
     </w:rPr>
   </w:style>
-  <w:style w:type="character" w:styleId="Bullets">
-    <w:name w:val="Bullets"/>
+  <w:style w:type="character" w:styleId="Bulletsuser">
+    <w:name w:val="Bullets (user)"/>
     <w:qFormat/>
     <w:rPr>
       <w:rFonts w:ascii="OpenSymbol" w:hAnsi="OpenSymbol" w:eastAsia="OpenSymbol" w:cs="OpenSymbol"/>
@@ -7889,8 +7628,8 @@
     </w:pPr>
     <w:rPr/>
   </w:style>
-  <w:style w:type="paragraph" w:styleId="FrameContents">
-    <w:name w:val="Frame Contents"/>
+  <w:style w:type="paragraph" w:styleId="FrameContentsuser">
+    <w:name w:val="Frame Contents (user)"/>
     <w:basedOn w:val="Standard"/>
     <w:qFormat/>
     <w:pPr/>

</xml_diff>